<commit_message>
Finished CIAS and Envass of progetto
</commit_message>
<xml_diff>
--- a/Progetto.docx
+++ b/Progetto.docx
@@ -19,121 +19,171 @@
       </w:r>
     </w:p>
     <w:p>
-      <w:r>
-        <w:t>Definito dal laboratorio CIAS ferrara.</w:t>
-      </w:r>
-    </w:p>
-    <w:p>
-      <w:r>
-        <w:t>CIAS fondato nel 2005,</w:t>
-      </w:r>
-      <w:r>
-        <w:t xml:space="preserve"> come struttura di ricerca del Dipartimento di Architettura</w:t>
-      </w:r>
-      <w:r>
-        <w:t xml:space="preserve">, poi nel </w:t>
-      </w:r>
-      <w:r>
-        <w:t xml:space="preserve">2013 il CIAS è diventato un Centro Interdipartimentale </w:t>
-      </w:r>
-      <w:r>
-        <w:t xml:space="preserve">ed infine nel 2024 è sotto il </w:t>
-      </w:r>
+      <w:pPr>
+        <w:rPr>
+          <w:u w:val="single"/>
+        </w:rPr>
+      </w:pPr>
+      <w:r>
+        <w:t>Il progetto è stato commissionato dal CIAS (Centro ricerche Inquinamento Fisico Chimico Microbiologico Ambienti Alta Sterilità) dell'Università degli Studi di Ferrara.</w:t>
+      </w:r>
+      <w:r>
+        <w:t xml:space="preserve">  Il Centro è stato fondato nel 2005 come struttura di ricerca interna del Dipartimento di Architettura. </w:t>
+      </w:r>
+      <w:r>
+        <w:t xml:space="preserve">Nel 2013, è stato trasformato in Centro Interdipartimentale </w:t>
+      </w:r>
+      <w:r>
+        <w:t>dell'Ateneo ed attualmente coinvolge il Dipartimento di Architettura e il Dipartimento di Scienze dell’Ambiente e della Prevenzione, che dal 2024 ne costituisce il dipartimento di afferenza.</w:t>
+      </w:r>
+      <w:r>
+        <w:t xml:space="preserve"> </w:t>
+      </w:r>
+    </w:p>
+    <w:p>
+      <w:r>
+        <w:t>Il CIAS integra ricerca scientifica, attività diagnostica e ingegneria impiantistica per la gestione del controllo della contaminazione e l’efficienza energetica in ambienti confinati complessi. Le sue attività si articolano in quattro principali macroaree:</w:t>
+      </w:r>
+    </w:p>
+    <w:p>
+      <w:pPr>
+        <w:pStyle w:val="Paragrafoelenco"/>
+        <w:numPr>
+          <w:ilvl w:val="0"/>
+          <w:numId w:val="8"/>
+        </w:numPr>
+      </w:pPr>
+      <w:proofErr w:type="spellStart"/>
       <w:r>
         <w:rPr>
           <w:b/>
           <w:bCs/>
         </w:rPr>
-        <w:t>Dipartimento di Scienze dell’Ambiente e della Prevenzione</w:t>
-      </w:r>
+        <w:t>Pollution</w:t>
+      </w:r>
+      <w:proofErr w:type="spellEnd"/>
       <w:r>
         <w:rPr>
           <w:b/>
           <w:bCs/>
         </w:rPr>
-        <w:t>.</w:t>
-      </w:r>
-      <w:r>
-        <w:t xml:space="preserve"> </w:t>
-      </w:r>
-    </w:p>
-    <w:p>
-      <w:r>
-        <w:t xml:space="preserve">Obbiettivo campionare ambienti di strutture pubbliche e non per verificare se la contaminazione microbiologica è a norma di legge. </w:t>
-      </w:r>
-      <w:r>
-        <w:br/>
-      </w:r>
-      <w:hyperlink r:id="rId5" w:history="1">
-        <w:r>
-          <w:rPr>
-            <w:rStyle w:val="Collegamentoipertestuale"/>
-          </w:rPr>
-          <w:t>https://cias-ferrara.it/</w:t>
-        </w:r>
-      </w:hyperlink>
-      <w:r>
-        <w:t xml:space="preserve"> </w:t>
-      </w:r>
-    </w:p>
-    <w:p>
-      <w:r>
-        <w:t>Vanno a condure campionamenti che devono obbedire delle regole sotto prove accreditate (metodi di campionamento</w:t>
-      </w:r>
-      <w:r>
-        <w:t xml:space="preserve"> (procedure, strumenti volte a condurre il campionamento)</w:t>
-      </w:r>
-      <w:r>
-        <w:t xml:space="preserve"> e metodi di </w:t>
-      </w:r>
-      <w:r>
-        <w:t>prova (come condurre analisi per quantificare la contaminazione)</w:t>
-      </w:r>
-      <w:r>
-        <w:t>)</w:t>
-      </w:r>
-      <w:r>
-        <w:t xml:space="preserve"> </w:t>
-      </w:r>
+        <w:t xml:space="preserve"> &amp; Health:</w:t>
+      </w:r>
+      <w:r>
+        <w:t xml:space="preserve"> analisi e interventi sui contaminanti di tipo fisico, chimico e microbiologico, aerei e di superficie, e dei loro effetti sulla salute umana e animale. Include la validazione sperimentale di protocolli di sanificazione clinica o industriale (aree GMP) e lo sviluppo di sistemi </w:t>
+      </w:r>
+      <w:proofErr w:type="spellStart"/>
+      <w:r>
+        <w:t>bio-based</w:t>
+      </w:r>
+      <w:proofErr w:type="spellEnd"/>
+      <w:r>
+        <w:t xml:space="preserve"> per il contrasto delle Infezioni Correlate all'Assistenza (ICA).</w:t>
+      </w:r>
+    </w:p>
+    <w:p>
+      <w:pPr>
+        <w:pStyle w:val="Paragrafoelenco"/>
+        <w:numPr>
+          <w:ilvl w:val="0"/>
+          <w:numId w:val="8"/>
+        </w:numPr>
+      </w:pPr>
       <w:r>
         <w:rPr>
           <w:b/>
           <w:bCs/>
         </w:rPr>
-        <w:t>UNI EN 13098</w:t>
-      </w:r>
+        <w:t>Environment &amp; Energy:</w:t>
+      </w:r>
+      <w:r>
+        <w:t xml:space="preserve"> analisi ambientali finalizzate al miglioramento del comfort, della qualità dell'aria e dell'efficienza impiantistica ed energetica, con particolare riferimento ai requisiti tecnici e strutturali di ambiti ad elevata sterilità come blocchi operatori e laboratori.</w:t>
+      </w:r>
+    </w:p>
+    <w:p>
+      <w:pPr>
+        <w:pStyle w:val="Paragrafoelenco"/>
+        <w:numPr>
+          <w:ilvl w:val="0"/>
+          <w:numId w:val="8"/>
+        </w:numPr>
+      </w:pPr>
       <w:r>
         <w:rPr>
           <w:b/>
           <w:bCs/>
         </w:rPr>
-        <w:t>(metodo di campionamento)</w:t>
-      </w:r>
+        <w:t>Heritage:</w:t>
+      </w:r>
+      <w:r>
+        <w:t xml:space="preserve"> analisi dei fenomeni di degrado biologico, fisico e chimico di beni di interesse storico-artistico finalizzate alla loro conservazione preventiva, unitamente alla progettazione di impianti idonei alla tutela degli spazi espositivi e museali.</w:t>
+      </w:r>
+    </w:p>
+    <w:p>
+      <w:pPr>
+        <w:pStyle w:val="Paragrafoelenco"/>
+        <w:numPr>
+          <w:ilvl w:val="0"/>
+          <w:numId w:val="8"/>
+        </w:numPr>
+      </w:pPr>
+      <w:proofErr w:type="spellStart"/>
       <w:r>
         <w:rPr>
           <w:b/>
           <w:bCs/>
         </w:rPr>
-        <w:t xml:space="preserve"> +</w:t>
-      </w:r>
+        <w:t>Safety</w:t>
+      </w:r>
+      <w:proofErr w:type="spellEnd"/>
       <w:r>
         <w:rPr>
           <w:b/>
           <w:bCs/>
         </w:rPr>
-        <w:t>UNI EN ISO 4833</w:t>
-      </w:r>
-      <w:r>
-        <w:rPr>
-          <w:b/>
-          <w:bCs/>
-        </w:rPr>
-        <w:t>(metodo di prova)</w:t>
-      </w:r>
-    </w:p>
-    <w:p>
-      <w:r>
-        <w:t>Il laboratorio è iscritto ad Accredia, ente italiano di accreditamento, il quale attesta l’affidabilità del laboratorio, facendo ispezioni periodiche.</w:t>
+        <w:t xml:space="preserve"> &amp; Training:</w:t>
+      </w:r>
+      <w:r>
+        <w:t xml:space="preserve"> ricerca applicata nel settore della sicurezza sul lavoro e della prevenzione incendi, accoppiata ad attività di formazione specialistica e aggiornamento professionale su procedure di biosicurezza e tecniche di analisi microbiologica.</w:t>
+      </w:r>
+    </w:p>
+    <w:p>
+      <w:r>
+        <w:t xml:space="preserve">Le attività di campionamento e le analisi di laboratorio sono condotte in conformità a metodi ufficiali accreditati, seguendo rigorosi protocolli standardizzati. Le procedure operative si articolano in due fasi sequenziali e interdipendenti: i metodi di campionamento definiscono le operazioni sul campo e la strumentazione necessaria per il prelievo rappresentativo della matrice ambientale, come stabilito, per esempio, dalla norma UNI EN 13098 per la pianificazione del campionamento di </w:t>
+      </w:r>
+      <w:proofErr w:type="spellStart"/>
+      <w:r>
+        <w:t>bioaerosol</w:t>
+      </w:r>
+      <w:proofErr w:type="spellEnd"/>
+      <w:r>
+        <w:t xml:space="preserve">; i metodi di prova stabiliscono i protocolli analitici e microbiologici di laboratorio per la determinazione e quantificazione della contaminazione, in conformità a standard come la norma UNI EN ISO 4833 per la conta dei microrganismi vivi. </w:t>
+      </w:r>
+      <w:r>
+        <w:t>In laboratorio, queste fasi costituiscono un ciclo operativo unico, validato formalmente congiuntamente dai due standard (</w:t>
+      </w:r>
+      <m:oMath>
+        <m:r>
+          <m:rPr>
+            <m:nor/>
+          </m:rPr>
+          <m:t>UNI EN 13098</m:t>
+        </m:r>
+        <m:r>
+          <w:rPr>
+            <w:rFonts w:ascii="Cambria Math" w:hAnsi="Cambria Math"/>
+          </w:rPr>
+          <m:t>+</m:t>
+        </m:r>
+        <m:r>
+          <m:rPr>
+            <m:nor/>
+          </m:rPr>
+          <m:t>UNI EN ISO 4833</m:t>
+        </m:r>
+      </m:oMath>
+      <w:r>
+        <w:t>). La conformità delle procedure e la competenza tecnica della struttura sono attestati dall’accreditamento di Accredia (Ente Italiano di Accreditamento), che ne garantisce l’affidabilità tramite verifiche ispettive e audit periodici.</w:t>
       </w:r>
     </w:p>
     <w:p>
@@ -151,47 +201,35 @@
     </w:p>
     <w:p>
       <w:r>
-        <w:t xml:space="preserve">È un progetto che è stato iniziatto e portato avanti dal laboratorio CIAS, con l’esigenza di disporre di un gestionale che fosse in grado di raccogliere tutte </w:t>
-      </w:r>
-      <w:r>
-        <w:t>le informazioni</w:t>
-      </w:r>
-      <w:r>
-        <w:t xml:space="preserve"> riguardanti i campioni. </w:t>
-      </w:r>
-    </w:p>
-    <w:p>
-      <w:r>
-        <w:t xml:space="preserve">Versione 1: Nasce come pagina statiche, dove si poteva semplicemente inserire ogni campione analizzato (con foto). Poi si potevano estrarre le informazioni su questi campioni e filtrare per progetto, struttura, data, etc… </w:t>
-      </w:r>
-    </w:p>
-    <w:p>
-      <w:r>
-        <w:t>Accredia ha richiesto una versione più moderna del gestionale, che potesse controllare più fasi della filiale.</w:t>
-      </w:r>
-    </w:p>
-    <w:p>
-      <w:r>
-        <w:t xml:space="preserve">CIAS ha fatto richiesta al laboratorio ACLAI, </w:t>
-      </w:r>
-      <w:r>
-        <w:t xml:space="preserve">di progettare la versione più avanzata del sistema precedente. </w:t>
-      </w:r>
-    </w:p>
-    <w:p>
-      <w:r>
-        <w:t xml:space="preserve">È stata analizzata l’intera filiale e individuato i macro blocchi di essa. </w:t>
-      </w:r>
-    </w:p>
-    <w:p>
-      <w:r>
-        <w:t xml:space="preserve">Il sistema è diviso in </w:t>
-      </w:r>
-      <w:r>
-        <w:t>6</w:t>
-      </w:r>
-      <w:r>
-        <w:t xml:space="preserve"> parti principali:</w:t>
+        <w:t xml:space="preserve">Il progetto ENVASS nasce e si sviluppa all’interno del laboratorio CIAS per rispondere alla necessità di creare un sistema gestionale centralizzato capace di archiviare e tracciare e gestire tutte le informazioni riguardanti i campioni analizzati. Nella sua prima versione, il sistema si presentava come un’interfaccia web statica, la cui funzione principale era la catalogazione manuale dei singoli campioni analizzati con possibilità di allegare la foto. </w:t>
+      </w:r>
+      <w:r>
+        <w:t>A seguire</w:t>
+      </w:r>
+      <w:r>
+        <w:t xml:space="preserve"> era poi possibile estrarre dei dati </w:t>
+      </w:r>
+      <w:r>
+        <w:t>filtri di ricerca basati su variabili chiave come il progetto di riferimento, la struttura ospitante e la cronologia temporale delle rilevazioni.</w:t>
+      </w:r>
+    </w:p>
+    <w:p>
+      <w:r>
+        <w:lastRenderedPageBreak/>
+        <w:t>Successivamente, in risposta alle crescenti esigenze di digitalizzazione e ai rigorosi requisiti di conformità e tracciabilità imposti dall’ente nazionale di accreditamento ACCREDIA, si è resa necessaria l’evoluzione della piattaforma verso un’architettura più moderna e integrata, capace di estendere il controllo informatico a tutte le fasi della filiera operativa e procedurale del laboratorio. </w:t>
+      </w:r>
+      <w:r>
+        <w:t xml:space="preserve"> </w:t>
+      </w:r>
+    </w:p>
+    <w:p>
+      <w:r>
+        <w:t>Per realizzare questa transizione tecnologica, il CIAS ha affidato al laboratorio ACLAI la progettazione e lo sviluppo di una versione avanzata del sistema preesistente.</w:t>
+      </w:r>
+    </w:p>
+    <w:p>
+      <w:r>
+        <w:t>L'analisi approfondita dell'intero flusso di lavoro e delle necessità normative ha permesso di mappare i processi core e di ingegnerizzare un'architettura software strutturata in sei macro-blocchi principali.</w:t>
       </w:r>
     </w:p>
     <w:p>
@@ -209,23 +247,30 @@
     </w:p>
     <w:p>
       <w:r>
-        <w:t>I committenti sono i clienti, coloro che vengono a richiedere il servizio e vengono registrate le informazioni di contatto, come telefono, email, indirizzo.</w:t>
-      </w:r>
-    </w:p>
-    <w:p>
-      <w:r>
-        <w:t xml:space="preserve">Le strutture, sono gli edifici, </w:t>
-      </w:r>
-      <w:r>
-        <w:t>e le partizioni sono le sta</w:t>
-      </w:r>
-      <w:r>
-        <w:t>nze, nel quale vengono condotti i campionamenti.</w:t>
-      </w:r>
-    </w:p>
-    <w:p>
-      <w:r>
-        <w:t xml:space="preserve">Le attività, sono il nome che viene definito per definire che funziona ha il campionamento. (da rivedere) </w:t>
+        <w:t xml:space="preserve">I committenti sono i clienti, coloro che vengono a richiedere il servizio e vengono registrate le informazioni di contatto, come telefono, </w:t>
+      </w:r>
+      <w:proofErr w:type="gramStart"/>
+      <w:r>
+        <w:t>email</w:t>
+      </w:r>
+      <w:proofErr w:type="gramEnd"/>
+      <w:r>
+        <w:t>, indirizzo.</w:t>
+      </w:r>
+    </w:p>
+    <w:p>
+      <w:r>
+        <w:t>Le strutture, sono gli edifici, e le partizioni sono le stanze, nel quale vengono condotti i campionamenti.</w:t>
+      </w:r>
+    </w:p>
+    <w:p>
+      <w:proofErr w:type="gramStart"/>
+      <w:r>
+        <w:t>Le attività,</w:t>
+      </w:r>
+      <w:proofErr w:type="gramEnd"/>
+      <w:r>
+        <w:t xml:space="preserve"> sono il nome che viene definito per definire che funziona ha il campionamento. (da rivedere) </w:t>
       </w:r>
     </w:p>
     <w:p>
@@ -238,7 +283,6 @@
         <w:pStyle w:val="Titolo3"/>
       </w:pPr>
       <w:r>
-        <w:lastRenderedPageBreak/>
         <w:t>Liste</w:t>
       </w:r>
     </w:p>
@@ -247,7 +291,23 @@
         <w:t xml:space="preserve">Le liste sono </w:t>
       </w:r>
       <w:r>
-        <w:t>un insieme di oggetti etereogeni che rappresentano parti fondamentali per la descrizione del progetto, come strumenti di campionamento, antibiotici, piastre, punti di campionamento, tipologia stanza, etc…</w:t>
+        <w:t xml:space="preserve">un insieme di oggetti </w:t>
+      </w:r>
+      <w:proofErr w:type="spellStart"/>
+      <w:r>
+        <w:t>etereogeni</w:t>
+      </w:r>
+      <w:proofErr w:type="spellEnd"/>
+      <w:r>
+        <w:t xml:space="preserve"> che rappresentano parti fondamentali per la descrizione del progetto, come strumenti di campionamento, antibiotici, piastre, punti di campionamento, tipologia stanza, </w:t>
+      </w:r>
+      <w:proofErr w:type="spellStart"/>
+      <w:r>
+        <w:t>etc</w:t>
+      </w:r>
+      <w:proofErr w:type="spellEnd"/>
+      <w:r>
+        <w:t>…</w:t>
       </w:r>
     </w:p>
     <w:p>
@@ -285,7 +345,15 @@
     </w:p>
     <w:p>
       <w:r>
-        <w:t>Una campagna può avere molteplici verbali, ma un verbale appartiene solo ad ‘una campagna. Quindi una volta definita la campagna, aggiungendo la partizione e l’area di partizione e la tipologia di verbale(interno o esterno) si crea il verbale.</w:t>
+        <w:t xml:space="preserve">Una campagna può avere molteplici verbali, ma un verbale appartiene solo ad ‘una campagna. Quindi una volta definita la campagna, aggiungendo la partizione e l’area di partizione e la tipologia di </w:t>
+      </w:r>
+      <w:proofErr w:type="gramStart"/>
+      <w:r>
+        <w:t>verbale(</w:t>
+      </w:r>
+      <w:proofErr w:type="gramEnd"/>
+      <w:r>
+        <w:t>interno o esterno) si crea il verbale.</w:t>
       </w:r>
     </w:p>
     <w:p>
@@ -295,7 +363,15 @@
     </w:p>
     <w:p>
       <w:r>
-        <w:t>Indipendentemente dalla tipologia di verbale le informazioni si dividono in 3 categorie</w:t>
+        <w:t xml:space="preserve">Indipendentemente dalla tipologia di verbale le informazioni si dividono in </w:t>
+      </w:r>
+      <w:proofErr w:type="gramStart"/>
+      <w:r>
+        <w:t>3</w:t>
+      </w:r>
+      <w:proofErr w:type="gramEnd"/>
+      <w:r>
+        <w:t xml:space="preserve"> categorie</w:t>
       </w:r>
       <w:r>
         <w:t>.</w:t>
@@ -334,6 +410,7 @@
         </w:numPr>
       </w:pPr>
       <w:r>
+        <w:lastRenderedPageBreak/>
         <w:t>Accettazione che viene compilata al ritorno dal campionamento se intorno, o alla consegna dei compiano da parte dell’ente esterno, che riporta dettagli del campionamento e del trasporto appena svolto.</w:t>
       </w:r>
       <w:r>
@@ -368,7 +445,15 @@
     </w:p>
     <w:p>
       <w:r>
-        <w:t>Come ulteriori test vengono eseguiti la speciazione (da definire) e la presenza di batteri gram (da spiegare)</w:t>
+        <w:t xml:space="preserve">Come ulteriori test vengono eseguiti la speciazione (da definire) e la presenza di batteri </w:t>
+      </w:r>
+      <w:proofErr w:type="spellStart"/>
+      <w:r>
+        <w:t>gram</w:t>
+      </w:r>
+      <w:proofErr w:type="spellEnd"/>
+      <w:r>
+        <w:t xml:space="preserve"> (da spiegare)</w:t>
       </w:r>
     </w:p>
     <w:p>
@@ -386,7 +471,6 @@
     </w:p>
     <w:p>
       <w:r>
-        <w:lastRenderedPageBreak/>
         <w:t xml:space="preserve">Le informazioni all’interno vengono recuperate automaticamente ad eccezione delle informative di </w:t>
       </w:r>
       <w:r>
@@ -426,7 +510,15 @@
         <w:t xml:space="preserve"> prima bloccate</w:t>
       </w:r>
       <w:r>
-        <w:t xml:space="preserve">, apparte il rapporto di prova dal </w:t>
+        <w:t xml:space="preserve">, </w:t>
+      </w:r>
+      <w:proofErr w:type="spellStart"/>
+      <w:r>
+        <w:t>apparte</w:t>
+      </w:r>
+      <w:proofErr w:type="spellEnd"/>
+      <w:r>
+        <w:t xml:space="preserve"> il rapporto di prova dal </w:t>
       </w:r>
       <w:r>
         <w:t>quale</w:t>
@@ -462,6 +554,625 @@
 <file path=word/numbering.xml><?xml version="1.0" encoding="utf-8"?>
 <w:numbering xmlns:wpc="http://schemas.microsoft.com/office/word/2010/wordprocessingCanvas" xmlns:cx="http://schemas.microsoft.com/office/drawing/2014/chartex" xmlns:cx1="http://schemas.microsoft.com/office/drawing/2015/9/8/chartex" xmlns:cx2="http://schemas.microsoft.com/office/drawing/2015/10/21/chartex" xmlns:cx3="http://schemas.microsoft.com/office/drawing/2016/5/9/chartex" xmlns:cx4="http://schemas.microsoft.com/office/drawing/2016/5/10/chartex" xmlns:cx5="http://schemas.microsoft.com/office/drawing/2016/5/11/chartex" xmlns:cx6="http://schemas.microsoft.com/office/drawing/2016/5/12/chartex" xmlns:cx7="http://schemas.microsoft.com/office/drawing/2016/5/13/chartex" xmlns:cx8="http://schemas.microsoft.com/office/drawing/2016/5/14/chartex" xmlns:mc="http://schemas.openxmlformats.org/markup-compatibility/2006" xmlns:aink="http://schemas.microsoft.com/office/drawing/2016/ink" xmlns:am3d="http://schemas.microsoft.com/office/drawing/2017/model3d" xmlns:o="urn:schemas-microsoft-com:office:office" xmlns:oel="http://schemas.microsoft.com/office/2019/extlst" xmlns:r="http://schemas.openxmlformats.org/officeDocument/2006/relationships" xmlns:m="http://schemas.openxmlformats.org/officeDocument/2006/math" xmlns:v="urn:schemas-microsoft-com:vml" xmlns:wp14="http://schemas.microsoft.com/office/word/2010/wordprocessingDrawing" xmlns:wp="http://schemas.openxmlformats.org/drawingml/2006/wordprocessingDrawing" xmlns:w10="urn:schemas-microsoft-com:office:word" xmlns:w="http://schemas.openxmlformats.org/wordprocessingml/2006/main" xmlns:w14="http://schemas.microsoft.com/office/word/2010/wordml" xmlns:w15="http://schemas.microsoft.com/office/word/2012/wordml" xmlns:w16cex="http://schemas.microsoft.com/office/word/2018/wordml/cex" xmlns:w16cid="http://schemas.microsoft.com/office/word/2016/wordml/cid" xmlns:w16="http://schemas.microsoft.com/office/word/2018/wordml" xmlns:w16du="http://schemas.microsoft.com/office/word/2023/wordml/word16du" xmlns:w16sdtdh="http://schemas.microsoft.com/office/word/2020/wordml/sdtdatahash" xmlns:w16sdtfl="http://schemas.microsoft.com/office/word/2024/wordml/sdtformatlock" xmlns:w16se="http://schemas.microsoft.com/office/word/2015/wordml/symex" xmlns:wpg="http://schemas.microsoft.com/office/word/2010/wordprocessingGroup" xmlns:wpi="http://schemas.microsoft.com/office/word/2010/wordprocessingInk" xmlns:wne="http://schemas.microsoft.com/office/word/2006/wordml" xmlns:wps="http://schemas.microsoft.com/office/word/2010/wordprocessingShape" mc:Ignorable="w14 w15 w16se w16cid w16 w16cex w16sdtdh w16sdtfl w16du wp14">
   <w:abstractNum w:abstractNumId="0" w15:restartNumberingAfterBreak="0">
+    <w:nsid w:val="0230298D"/>
+    <w:multiLevelType w:val="hybridMultilevel"/>
+    <w:tmpl w:val="FEAA544C"/>
+    <w:lvl w:ilvl="0" w:tplc="0410000F">
+      <w:start w:val="1"/>
+      <w:numFmt w:val="decimal"/>
+      <w:lvlText w:val="%1."/>
+      <w:lvlJc w:val="left"/>
+      <w:pPr>
+        <w:ind w:left="720" w:hanging="360"/>
+      </w:pPr>
+    </w:lvl>
+    <w:lvl w:ilvl="1" w:tplc="04100019" w:tentative="1">
+      <w:start w:val="1"/>
+      <w:numFmt w:val="lowerLetter"/>
+      <w:lvlText w:val="%2."/>
+      <w:lvlJc w:val="left"/>
+      <w:pPr>
+        <w:ind w:left="1440" w:hanging="360"/>
+      </w:pPr>
+    </w:lvl>
+    <w:lvl w:ilvl="2" w:tplc="0410001B" w:tentative="1">
+      <w:start w:val="1"/>
+      <w:numFmt w:val="lowerRoman"/>
+      <w:lvlText w:val="%3."/>
+      <w:lvlJc w:val="right"/>
+      <w:pPr>
+        <w:ind w:left="2160" w:hanging="180"/>
+      </w:pPr>
+    </w:lvl>
+    <w:lvl w:ilvl="3" w:tplc="0410000F" w:tentative="1">
+      <w:start w:val="1"/>
+      <w:numFmt w:val="decimal"/>
+      <w:lvlText w:val="%4."/>
+      <w:lvlJc w:val="left"/>
+      <w:pPr>
+        <w:ind w:left="2880" w:hanging="360"/>
+      </w:pPr>
+    </w:lvl>
+    <w:lvl w:ilvl="4" w:tplc="04100019" w:tentative="1">
+      <w:start w:val="1"/>
+      <w:numFmt w:val="lowerLetter"/>
+      <w:lvlText w:val="%5."/>
+      <w:lvlJc w:val="left"/>
+      <w:pPr>
+        <w:ind w:left="3600" w:hanging="360"/>
+      </w:pPr>
+    </w:lvl>
+    <w:lvl w:ilvl="5" w:tplc="0410001B" w:tentative="1">
+      <w:start w:val="1"/>
+      <w:numFmt w:val="lowerRoman"/>
+      <w:lvlText w:val="%6."/>
+      <w:lvlJc w:val="right"/>
+      <w:pPr>
+        <w:ind w:left="4320" w:hanging="180"/>
+      </w:pPr>
+    </w:lvl>
+    <w:lvl w:ilvl="6" w:tplc="0410000F" w:tentative="1">
+      <w:start w:val="1"/>
+      <w:numFmt w:val="decimal"/>
+      <w:lvlText w:val="%7."/>
+      <w:lvlJc w:val="left"/>
+      <w:pPr>
+        <w:ind w:left="5040" w:hanging="360"/>
+      </w:pPr>
+    </w:lvl>
+    <w:lvl w:ilvl="7" w:tplc="04100019" w:tentative="1">
+      <w:start w:val="1"/>
+      <w:numFmt w:val="lowerLetter"/>
+      <w:lvlText w:val="%8."/>
+      <w:lvlJc w:val="left"/>
+      <w:pPr>
+        <w:ind w:left="5760" w:hanging="360"/>
+      </w:pPr>
+    </w:lvl>
+    <w:lvl w:ilvl="8" w:tplc="0410001B" w:tentative="1">
+      <w:start w:val="1"/>
+      <w:numFmt w:val="lowerRoman"/>
+      <w:lvlText w:val="%9."/>
+      <w:lvlJc w:val="right"/>
+      <w:pPr>
+        <w:ind w:left="6480" w:hanging="180"/>
+      </w:pPr>
+    </w:lvl>
+  </w:abstractNum>
+  <w:abstractNum w:abstractNumId="1" w15:restartNumberingAfterBreak="0">
+    <w:nsid w:val="0DF05915"/>
+    <w:multiLevelType w:val="hybridMultilevel"/>
+    <w:tmpl w:val="A6EE9A64"/>
+    <w:lvl w:ilvl="0" w:tplc="0410000F">
+      <w:start w:val="1"/>
+      <w:numFmt w:val="decimal"/>
+      <w:lvlText w:val="%1."/>
+      <w:lvlJc w:val="left"/>
+      <w:pPr>
+        <w:ind w:left="720" w:hanging="360"/>
+      </w:pPr>
+    </w:lvl>
+    <w:lvl w:ilvl="1" w:tplc="04100019" w:tentative="1">
+      <w:start w:val="1"/>
+      <w:numFmt w:val="lowerLetter"/>
+      <w:lvlText w:val="%2."/>
+      <w:lvlJc w:val="left"/>
+      <w:pPr>
+        <w:ind w:left="1440" w:hanging="360"/>
+      </w:pPr>
+    </w:lvl>
+    <w:lvl w:ilvl="2" w:tplc="0410001B" w:tentative="1">
+      <w:start w:val="1"/>
+      <w:numFmt w:val="lowerRoman"/>
+      <w:lvlText w:val="%3."/>
+      <w:lvlJc w:val="right"/>
+      <w:pPr>
+        <w:ind w:left="2160" w:hanging="180"/>
+      </w:pPr>
+    </w:lvl>
+    <w:lvl w:ilvl="3" w:tplc="0410000F" w:tentative="1">
+      <w:start w:val="1"/>
+      <w:numFmt w:val="decimal"/>
+      <w:lvlText w:val="%4."/>
+      <w:lvlJc w:val="left"/>
+      <w:pPr>
+        <w:ind w:left="2880" w:hanging="360"/>
+      </w:pPr>
+    </w:lvl>
+    <w:lvl w:ilvl="4" w:tplc="04100019" w:tentative="1">
+      <w:start w:val="1"/>
+      <w:numFmt w:val="lowerLetter"/>
+      <w:lvlText w:val="%5."/>
+      <w:lvlJc w:val="left"/>
+      <w:pPr>
+        <w:ind w:left="3600" w:hanging="360"/>
+      </w:pPr>
+    </w:lvl>
+    <w:lvl w:ilvl="5" w:tplc="0410001B" w:tentative="1">
+      <w:start w:val="1"/>
+      <w:numFmt w:val="lowerRoman"/>
+      <w:lvlText w:val="%6."/>
+      <w:lvlJc w:val="right"/>
+      <w:pPr>
+        <w:ind w:left="4320" w:hanging="180"/>
+      </w:pPr>
+    </w:lvl>
+    <w:lvl w:ilvl="6" w:tplc="0410000F" w:tentative="1">
+      <w:start w:val="1"/>
+      <w:numFmt w:val="decimal"/>
+      <w:lvlText w:val="%7."/>
+      <w:lvlJc w:val="left"/>
+      <w:pPr>
+        <w:ind w:left="5040" w:hanging="360"/>
+      </w:pPr>
+    </w:lvl>
+    <w:lvl w:ilvl="7" w:tplc="04100019" w:tentative="1">
+      <w:start w:val="1"/>
+      <w:numFmt w:val="lowerLetter"/>
+      <w:lvlText w:val="%8."/>
+      <w:lvlJc w:val="left"/>
+      <w:pPr>
+        <w:ind w:left="5760" w:hanging="360"/>
+      </w:pPr>
+    </w:lvl>
+    <w:lvl w:ilvl="8" w:tplc="0410001B" w:tentative="1">
+      <w:start w:val="1"/>
+      <w:numFmt w:val="lowerRoman"/>
+      <w:lvlText w:val="%9."/>
+      <w:lvlJc w:val="right"/>
+      <w:pPr>
+        <w:ind w:left="6480" w:hanging="180"/>
+      </w:pPr>
+    </w:lvl>
+  </w:abstractNum>
+  <w:abstractNum w:abstractNumId="2" w15:restartNumberingAfterBreak="0">
+    <w:nsid w:val="2A2638CE"/>
+    <w:multiLevelType w:val="multilevel"/>
+    <w:tmpl w:val="C936B6FA"/>
+    <w:lvl w:ilvl="0">
+      <w:start w:val="1"/>
+      <w:numFmt w:val="bullet"/>
+      <w:lvlText w:val=""/>
+      <w:lvlJc w:val="left"/>
+      <w:pPr>
+        <w:tabs>
+          <w:tab w:val="num" w:pos="720"/>
+        </w:tabs>
+        <w:ind w:left="720" w:hanging="360"/>
+      </w:pPr>
+      <w:rPr>
+        <w:rFonts w:ascii="Symbol" w:hAnsi="Symbol" w:hint="default"/>
+        <w:sz w:val="20"/>
+      </w:rPr>
+    </w:lvl>
+    <w:lvl w:ilvl="1" w:tentative="1">
+      <w:start w:val="1"/>
+      <w:numFmt w:val="bullet"/>
+      <w:lvlText w:val="o"/>
+      <w:lvlJc w:val="left"/>
+      <w:pPr>
+        <w:tabs>
+          <w:tab w:val="num" w:pos="1440"/>
+        </w:tabs>
+        <w:ind w:left="1440" w:hanging="360"/>
+      </w:pPr>
+      <w:rPr>
+        <w:rFonts w:ascii="Courier New" w:hAnsi="Courier New" w:hint="default"/>
+        <w:sz w:val="20"/>
+      </w:rPr>
+    </w:lvl>
+    <w:lvl w:ilvl="2" w:tentative="1">
+      <w:start w:val="1"/>
+      <w:numFmt w:val="bullet"/>
+      <w:lvlText w:val=""/>
+      <w:lvlJc w:val="left"/>
+      <w:pPr>
+        <w:tabs>
+          <w:tab w:val="num" w:pos="2160"/>
+        </w:tabs>
+        <w:ind w:left="2160" w:hanging="360"/>
+      </w:pPr>
+      <w:rPr>
+        <w:rFonts w:ascii="Wingdings" w:hAnsi="Wingdings" w:hint="default"/>
+        <w:sz w:val="20"/>
+      </w:rPr>
+    </w:lvl>
+    <w:lvl w:ilvl="3" w:tentative="1">
+      <w:start w:val="1"/>
+      <w:numFmt w:val="bullet"/>
+      <w:lvlText w:val=""/>
+      <w:lvlJc w:val="left"/>
+      <w:pPr>
+        <w:tabs>
+          <w:tab w:val="num" w:pos="2880"/>
+        </w:tabs>
+        <w:ind w:left="2880" w:hanging="360"/>
+      </w:pPr>
+      <w:rPr>
+        <w:rFonts w:ascii="Wingdings" w:hAnsi="Wingdings" w:hint="default"/>
+        <w:sz w:val="20"/>
+      </w:rPr>
+    </w:lvl>
+    <w:lvl w:ilvl="4" w:tentative="1">
+      <w:start w:val="1"/>
+      <w:numFmt w:val="bullet"/>
+      <w:lvlText w:val=""/>
+      <w:lvlJc w:val="left"/>
+      <w:pPr>
+        <w:tabs>
+          <w:tab w:val="num" w:pos="3600"/>
+        </w:tabs>
+        <w:ind w:left="3600" w:hanging="360"/>
+      </w:pPr>
+      <w:rPr>
+        <w:rFonts w:ascii="Wingdings" w:hAnsi="Wingdings" w:hint="default"/>
+        <w:sz w:val="20"/>
+      </w:rPr>
+    </w:lvl>
+    <w:lvl w:ilvl="5" w:tentative="1">
+      <w:start w:val="1"/>
+      <w:numFmt w:val="bullet"/>
+      <w:lvlText w:val=""/>
+      <w:lvlJc w:val="left"/>
+      <w:pPr>
+        <w:tabs>
+          <w:tab w:val="num" w:pos="4320"/>
+        </w:tabs>
+        <w:ind w:left="4320" w:hanging="360"/>
+      </w:pPr>
+      <w:rPr>
+        <w:rFonts w:ascii="Wingdings" w:hAnsi="Wingdings" w:hint="default"/>
+        <w:sz w:val="20"/>
+      </w:rPr>
+    </w:lvl>
+    <w:lvl w:ilvl="6" w:tentative="1">
+      <w:start w:val="1"/>
+      <w:numFmt w:val="bullet"/>
+      <w:lvlText w:val=""/>
+      <w:lvlJc w:val="left"/>
+      <w:pPr>
+        <w:tabs>
+          <w:tab w:val="num" w:pos="5040"/>
+        </w:tabs>
+        <w:ind w:left="5040" w:hanging="360"/>
+      </w:pPr>
+      <w:rPr>
+        <w:rFonts w:ascii="Wingdings" w:hAnsi="Wingdings" w:hint="default"/>
+        <w:sz w:val="20"/>
+      </w:rPr>
+    </w:lvl>
+    <w:lvl w:ilvl="7" w:tentative="1">
+      <w:start w:val="1"/>
+      <w:numFmt w:val="bullet"/>
+      <w:lvlText w:val=""/>
+      <w:lvlJc w:val="left"/>
+      <w:pPr>
+        <w:tabs>
+          <w:tab w:val="num" w:pos="5760"/>
+        </w:tabs>
+        <w:ind w:left="5760" w:hanging="360"/>
+      </w:pPr>
+      <w:rPr>
+        <w:rFonts w:ascii="Wingdings" w:hAnsi="Wingdings" w:hint="default"/>
+        <w:sz w:val="20"/>
+      </w:rPr>
+    </w:lvl>
+    <w:lvl w:ilvl="8" w:tentative="1">
+      <w:start w:val="1"/>
+      <w:numFmt w:val="bullet"/>
+      <w:lvlText w:val=""/>
+      <w:lvlJc w:val="left"/>
+      <w:pPr>
+        <w:tabs>
+          <w:tab w:val="num" w:pos="6480"/>
+        </w:tabs>
+        <w:ind w:left="6480" w:hanging="360"/>
+      </w:pPr>
+      <w:rPr>
+        <w:rFonts w:ascii="Wingdings" w:hAnsi="Wingdings" w:hint="default"/>
+        <w:sz w:val="20"/>
+      </w:rPr>
+    </w:lvl>
+  </w:abstractNum>
+  <w:abstractNum w:abstractNumId="3" w15:restartNumberingAfterBreak="0">
+    <w:nsid w:val="2D641EE9"/>
+    <w:multiLevelType w:val="multilevel"/>
+    <w:tmpl w:val="242C21B6"/>
+    <w:lvl w:ilvl="0">
+      <w:start w:val="1"/>
+      <w:numFmt w:val="bullet"/>
+      <w:lvlText w:val=""/>
+      <w:lvlJc w:val="left"/>
+      <w:pPr>
+        <w:tabs>
+          <w:tab w:val="num" w:pos="720"/>
+        </w:tabs>
+        <w:ind w:left="720" w:hanging="360"/>
+      </w:pPr>
+      <w:rPr>
+        <w:rFonts w:ascii="Symbol" w:hAnsi="Symbol" w:hint="default"/>
+        <w:sz w:val="20"/>
+      </w:rPr>
+    </w:lvl>
+    <w:lvl w:ilvl="1" w:tentative="1">
+      <w:start w:val="1"/>
+      <w:numFmt w:val="bullet"/>
+      <w:lvlText w:val="o"/>
+      <w:lvlJc w:val="left"/>
+      <w:pPr>
+        <w:tabs>
+          <w:tab w:val="num" w:pos="1440"/>
+        </w:tabs>
+        <w:ind w:left="1440" w:hanging="360"/>
+      </w:pPr>
+      <w:rPr>
+        <w:rFonts w:ascii="Courier New" w:hAnsi="Courier New" w:hint="default"/>
+        <w:sz w:val="20"/>
+      </w:rPr>
+    </w:lvl>
+    <w:lvl w:ilvl="2" w:tentative="1">
+      <w:start w:val="1"/>
+      <w:numFmt w:val="bullet"/>
+      <w:lvlText w:val=""/>
+      <w:lvlJc w:val="left"/>
+      <w:pPr>
+        <w:tabs>
+          <w:tab w:val="num" w:pos="2160"/>
+        </w:tabs>
+        <w:ind w:left="2160" w:hanging="360"/>
+      </w:pPr>
+      <w:rPr>
+        <w:rFonts w:ascii="Wingdings" w:hAnsi="Wingdings" w:hint="default"/>
+        <w:sz w:val="20"/>
+      </w:rPr>
+    </w:lvl>
+    <w:lvl w:ilvl="3" w:tentative="1">
+      <w:start w:val="1"/>
+      <w:numFmt w:val="bullet"/>
+      <w:lvlText w:val=""/>
+      <w:lvlJc w:val="left"/>
+      <w:pPr>
+        <w:tabs>
+          <w:tab w:val="num" w:pos="2880"/>
+        </w:tabs>
+        <w:ind w:left="2880" w:hanging="360"/>
+      </w:pPr>
+      <w:rPr>
+        <w:rFonts w:ascii="Wingdings" w:hAnsi="Wingdings" w:hint="default"/>
+        <w:sz w:val="20"/>
+      </w:rPr>
+    </w:lvl>
+    <w:lvl w:ilvl="4" w:tentative="1">
+      <w:start w:val="1"/>
+      <w:numFmt w:val="bullet"/>
+      <w:lvlText w:val=""/>
+      <w:lvlJc w:val="left"/>
+      <w:pPr>
+        <w:tabs>
+          <w:tab w:val="num" w:pos="3600"/>
+        </w:tabs>
+        <w:ind w:left="3600" w:hanging="360"/>
+      </w:pPr>
+      <w:rPr>
+        <w:rFonts w:ascii="Wingdings" w:hAnsi="Wingdings" w:hint="default"/>
+        <w:sz w:val="20"/>
+      </w:rPr>
+    </w:lvl>
+    <w:lvl w:ilvl="5" w:tentative="1">
+      <w:start w:val="1"/>
+      <w:numFmt w:val="bullet"/>
+      <w:lvlText w:val=""/>
+      <w:lvlJc w:val="left"/>
+      <w:pPr>
+        <w:tabs>
+          <w:tab w:val="num" w:pos="4320"/>
+        </w:tabs>
+        <w:ind w:left="4320" w:hanging="360"/>
+      </w:pPr>
+      <w:rPr>
+        <w:rFonts w:ascii="Wingdings" w:hAnsi="Wingdings" w:hint="default"/>
+        <w:sz w:val="20"/>
+      </w:rPr>
+    </w:lvl>
+    <w:lvl w:ilvl="6" w:tentative="1">
+      <w:start w:val="1"/>
+      <w:numFmt w:val="bullet"/>
+      <w:lvlText w:val=""/>
+      <w:lvlJc w:val="left"/>
+      <w:pPr>
+        <w:tabs>
+          <w:tab w:val="num" w:pos="5040"/>
+        </w:tabs>
+        <w:ind w:left="5040" w:hanging="360"/>
+      </w:pPr>
+      <w:rPr>
+        <w:rFonts w:ascii="Wingdings" w:hAnsi="Wingdings" w:hint="default"/>
+        <w:sz w:val="20"/>
+      </w:rPr>
+    </w:lvl>
+    <w:lvl w:ilvl="7" w:tentative="1">
+      <w:start w:val="1"/>
+      <w:numFmt w:val="bullet"/>
+      <w:lvlText w:val=""/>
+      <w:lvlJc w:val="left"/>
+      <w:pPr>
+        <w:tabs>
+          <w:tab w:val="num" w:pos="5760"/>
+        </w:tabs>
+        <w:ind w:left="5760" w:hanging="360"/>
+      </w:pPr>
+      <w:rPr>
+        <w:rFonts w:ascii="Wingdings" w:hAnsi="Wingdings" w:hint="default"/>
+        <w:sz w:val="20"/>
+      </w:rPr>
+    </w:lvl>
+    <w:lvl w:ilvl="8" w:tentative="1">
+      <w:start w:val="1"/>
+      <w:numFmt w:val="bullet"/>
+      <w:lvlText w:val=""/>
+      <w:lvlJc w:val="left"/>
+      <w:pPr>
+        <w:tabs>
+          <w:tab w:val="num" w:pos="6480"/>
+        </w:tabs>
+        <w:ind w:left="6480" w:hanging="360"/>
+      </w:pPr>
+      <w:rPr>
+        <w:rFonts w:ascii="Wingdings" w:hAnsi="Wingdings" w:hint="default"/>
+        <w:sz w:val="20"/>
+      </w:rPr>
+    </w:lvl>
+  </w:abstractNum>
+  <w:abstractNum w:abstractNumId="4" w15:restartNumberingAfterBreak="0">
+    <w:nsid w:val="45993C04"/>
+    <w:multiLevelType w:val="multilevel"/>
+    <w:tmpl w:val="67F471E4"/>
+    <w:lvl w:ilvl="0">
+      <w:start w:val="1"/>
+      <w:numFmt w:val="bullet"/>
+      <w:lvlText w:val=""/>
+      <w:lvlJc w:val="left"/>
+      <w:pPr>
+        <w:tabs>
+          <w:tab w:val="num" w:pos="720"/>
+        </w:tabs>
+        <w:ind w:left="720" w:hanging="360"/>
+      </w:pPr>
+      <w:rPr>
+        <w:rFonts w:ascii="Symbol" w:hAnsi="Symbol" w:hint="default"/>
+        <w:sz w:val="20"/>
+      </w:rPr>
+    </w:lvl>
+    <w:lvl w:ilvl="1" w:tentative="1">
+      <w:start w:val="1"/>
+      <w:numFmt w:val="bullet"/>
+      <w:lvlText w:val="o"/>
+      <w:lvlJc w:val="left"/>
+      <w:pPr>
+        <w:tabs>
+          <w:tab w:val="num" w:pos="1440"/>
+        </w:tabs>
+        <w:ind w:left="1440" w:hanging="360"/>
+      </w:pPr>
+      <w:rPr>
+        <w:rFonts w:ascii="Courier New" w:hAnsi="Courier New" w:hint="default"/>
+        <w:sz w:val="20"/>
+      </w:rPr>
+    </w:lvl>
+    <w:lvl w:ilvl="2" w:tentative="1">
+      <w:start w:val="1"/>
+      <w:numFmt w:val="bullet"/>
+      <w:lvlText w:val=""/>
+      <w:lvlJc w:val="left"/>
+      <w:pPr>
+        <w:tabs>
+          <w:tab w:val="num" w:pos="2160"/>
+        </w:tabs>
+        <w:ind w:left="2160" w:hanging="360"/>
+      </w:pPr>
+      <w:rPr>
+        <w:rFonts w:ascii="Wingdings" w:hAnsi="Wingdings" w:hint="default"/>
+        <w:sz w:val="20"/>
+      </w:rPr>
+    </w:lvl>
+    <w:lvl w:ilvl="3" w:tentative="1">
+      <w:start w:val="1"/>
+      <w:numFmt w:val="bullet"/>
+      <w:lvlText w:val=""/>
+      <w:lvlJc w:val="left"/>
+      <w:pPr>
+        <w:tabs>
+          <w:tab w:val="num" w:pos="2880"/>
+        </w:tabs>
+        <w:ind w:left="2880" w:hanging="360"/>
+      </w:pPr>
+      <w:rPr>
+        <w:rFonts w:ascii="Wingdings" w:hAnsi="Wingdings" w:hint="default"/>
+        <w:sz w:val="20"/>
+      </w:rPr>
+    </w:lvl>
+    <w:lvl w:ilvl="4" w:tentative="1">
+      <w:start w:val="1"/>
+      <w:numFmt w:val="bullet"/>
+      <w:lvlText w:val=""/>
+      <w:lvlJc w:val="left"/>
+      <w:pPr>
+        <w:tabs>
+          <w:tab w:val="num" w:pos="3600"/>
+        </w:tabs>
+        <w:ind w:left="3600" w:hanging="360"/>
+      </w:pPr>
+      <w:rPr>
+        <w:rFonts w:ascii="Wingdings" w:hAnsi="Wingdings" w:hint="default"/>
+        <w:sz w:val="20"/>
+      </w:rPr>
+    </w:lvl>
+    <w:lvl w:ilvl="5" w:tentative="1">
+      <w:start w:val="1"/>
+      <w:numFmt w:val="bullet"/>
+      <w:lvlText w:val=""/>
+      <w:lvlJc w:val="left"/>
+      <w:pPr>
+        <w:tabs>
+          <w:tab w:val="num" w:pos="4320"/>
+        </w:tabs>
+        <w:ind w:left="4320" w:hanging="360"/>
+      </w:pPr>
+      <w:rPr>
+        <w:rFonts w:ascii="Wingdings" w:hAnsi="Wingdings" w:hint="default"/>
+        <w:sz w:val="20"/>
+      </w:rPr>
+    </w:lvl>
+    <w:lvl w:ilvl="6" w:tentative="1">
+      <w:start w:val="1"/>
+      <w:numFmt w:val="bullet"/>
+      <w:lvlText w:val=""/>
+      <w:lvlJc w:val="left"/>
+      <w:pPr>
+        <w:tabs>
+          <w:tab w:val="num" w:pos="5040"/>
+        </w:tabs>
+        <w:ind w:left="5040" w:hanging="360"/>
+      </w:pPr>
+      <w:rPr>
+        <w:rFonts w:ascii="Wingdings" w:hAnsi="Wingdings" w:hint="default"/>
+        <w:sz w:val="20"/>
+      </w:rPr>
+    </w:lvl>
+    <w:lvl w:ilvl="7" w:tentative="1">
+      <w:start w:val="1"/>
+      <w:numFmt w:val="bullet"/>
+      <w:lvlText w:val=""/>
+      <w:lvlJc w:val="left"/>
+      <w:pPr>
+        <w:tabs>
+          <w:tab w:val="num" w:pos="5760"/>
+        </w:tabs>
+        <w:ind w:left="5760" w:hanging="360"/>
+      </w:pPr>
+      <w:rPr>
+        <w:rFonts w:ascii="Wingdings" w:hAnsi="Wingdings" w:hint="default"/>
+        <w:sz w:val="20"/>
+      </w:rPr>
+    </w:lvl>
+    <w:lvl w:ilvl="8" w:tentative="1">
+      <w:start w:val="1"/>
+      <w:numFmt w:val="bullet"/>
+      <w:lvlText w:val=""/>
+      <w:lvlJc w:val="left"/>
+      <w:pPr>
+        <w:tabs>
+          <w:tab w:val="num" w:pos="6480"/>
+        </w:tabs>
+        <w:ind w:left="6480" w:hanging="360"/>
+      </w:pPr>
+      <w:rPr>
+        <w:rFonts w:ascii="Wingdings" w:hAnsi="Wingdings" w:hint="default"/>
+        <w:sz w:val="20"/>
+      </w:rPr>
+    </w:lvl>
+  </w:abstractNum>
+  <w:abstractNum w:abstractNumId="5" w15:restartNumberingAfterBreak="0">
     <w:nsid w:val="7C3552EF"/>
     <w:multiLevelType w:val="hybridMultilevel"/>
     <w:tmpl w:val="70667446"/>
@@ -550,7 +1261,263 @@
       </w:pPr>
     </w:lvl>
   </w:abstractNum>
+  <w:abstractNum w:abstractNumId="6" w15:restartNumberingAfterBreak="0">
+    <w:nsid w:val="7D8D708D"/>
+    <w:multiLevelType w:val="hybridMultilevel"/>
+    <w:tmpl w:val="D114722C"/>
+    <w:lvl w:ilvl="0" w:tplc="0410000F">
+      <w:start w:val="1"/>
+      <w:numFmt w:val="decimal"/>
+      <w:lvlText w:val="%1."/>
+      <w:lvlJc w:val="left"/>
+      <w:pPr>
+        <w:ind w:left="720" w:hanging="360"/>
+      </w:pPr>
+    </w:lvl>
+    <w:lvl w:ilvl="1" w:tplc="04100019" w:tentative="1">
+      <w:start w:val="1"/>
+      <w:numFmt w:val="lowerLetter"/>
+      <w:lvlText w:val="%2."/>
+      <w:lvlJc w:val="left"/>
+      <w:pPr>
+        <w:ind w:left="1440" w:hanging="360"/>
+      </w:pPr>
+    </w:lvl>
+    <w:lvl w:ilvl="2" w:tplc="0410001B" w:tentative="1">
+      <w:start w:val="1"/>
+      <w:numFmt w:val="lowerRoman"/>
+      <w:lvlText w:val="%3."/>
+      <w:lvlJc w:val="right"/>
+      <w:pPr>
+        <w:ind w:left="2160" w:hanging="180"/>
+      </w:pPr>
+    </w:lvl>
+    <w:lvl w:ilvl="3" w:tplc="0410000F" w:tentative="1">
+      <w:start w:val="1"/>
+      <w:numFmt w:val="decimal"/>
+      <w:lvlText w:val="%4."/>
+      <w:lvlJc w:val="left"/>
+      <w:pPr>
+        <w:ind w:left="2880" w:hanging="360"/>
+      </w:pPr>
+    </w:lvl>
+    <w:lvl w:ilvl="4" w:tplc="04100019" w:tentative="1">
+      <w:start w:val="1"/>
+      <w:numFmt w:val="lowerLetter"/>
+      <w:lvlText w:val="%5."/>
+      <w:lvlJc w:val="left"/>
+      <w:pPr>
+        <w:ind w:left="3600" w:hanging="360"/>
+      </w:pPr>
+    </w:lvl>
+    <w:lvl w:ilvl="5" w:tplc="0410001B" w:tentative="1">
+      <w:start w:val="1"/>
+      <w:numFmt w:val="lowerRoman"/>
+      <w:lvlText w:val="%6."/>
+      <w:lvlJc w:val="right"/>
+      <w:pPr>
+        <w:ind w:left="4320" w:hanging="180"/>
+      </w:pPr>
+    </w:lvl>
+    <w:lvl w:ilvl="6" w:tplc="0410000F" w:tentative="1">
+      <w:start w:val="1"/>
+      <w:numFmt w:val="decimal"/>
+      <w:lvlText w:val="%7."/>
+      <w:lvlJc w:val="left"/>
+      <w:pPr>
+        <w:ind w:left="5040" w:hanging="360"/>
+      </w:pPr>
+    </w:lvl>
+    <w:lvl w:ilvl="7" w:tplc="04100019" w:tentative="1">
+      <w:start w:val="1"/>
+      <w:numFmt w:val="lowerLetter"/>
+      <w:lvlText w:val="%8."/>
+      <w:lvlJc w:val="left"/>
+      <w:pPr>
+        <w:ind w:left="5760" w:hanging="360"/>
+      </w:pPr>
+    </w:lvl>
+    <w:lvl w:ilvl="8" w:tplc="0410001B" w:tentative="1">
+      <w:start w:val="1"/>
+      <w:numFmt w:val="lowerRoman"/>
+      <w:lvlText w:val="%9."/>
+      <w:lvlJc w:val="right"/>
+      <w:pPr>
+        <w:ind w:left="6480" w:hanging="180"/>
+      </w:pPr>
+    </w:lvl>
+  </w:abstractNum>
+  <w:abstractNum w:abstractNumId="7" w15:restartNumberingAfterBreak="0">
+    <w:nsid w:val="7FBB6EE7"/>
+    <w:multiLevelType w:val="multilevel"/>
+    <w:tmpl w:val="DE20186A"/>
+    <w:lvl w:ilvl="0">
+      <w:start w:val="1"/>
+      <w:numFmt w:val="bullet"/>
+      <w:lvlText w:val=""/>
+      <w:lvlJc w:val="left"/>
+      <w:pPr>
+        <w:tabs>
+          <w:tab w:val="num" w:pos="720"/>
+        </w:tabs>
+        <w:ind w:left="720" w:hanging="360"/>
+      </w:pPr>
+      <w:rPr>
+        <w:rFonts w:ascii="Symbol" w:hAnsi="Symbol" w:hint="default"/>
+        <w:sz w:val="20"/>
+      </w:rPr>
+    </w:lvl>
+    <w:lvl w:ilvl="1" w:tentative="1">
+      <w:start w:val="1"/>
+      <w:numFmt w:val="bullet"/>
+      <w:lvlText w:val="o"/>
+      <w:lvlJc w:val="left"/>
+      <w:pPr>
+        <w:tabs>
+          <w:tab w:val="num" w:pos="1440"/>
+        </w:tabs>
+        <w:ind w:left="1440" w:hanging="360"/>
+      </w:pPr>
+      <w:rPr>
+        <w:rFonts w:ascii="Courier New" w:hAnsi="Courier New" w:hint="default"/>
+        <w:sz w:val="20"/>
+      </w:rPr>
+    </w:lvl>
+    <w:lvl w:ilvl="2" w:tentative="1">
+      <w:start w:val="1"/>
+      <w:numFmt w:val="bullet"/>
+      <w:lvlText w:val=""/>
+      <w:lvlJc w:val="left"/>
+      <w:pPr>
+        <w:tabs>
+          <w:tab w:val="num" w:pos="2160"/>
+        </w:tabs>
+        <w:ind w:left="2160" w:hanging="360"/>
+      </w:pPr>
+      <w:rPr>
+        <w:rFonts w:ascii="Wingdings" w:hAnsi="Wingdings" w:hint="default"/>
+        <w:sz w:val="20"/>
+      </w:rPr>
+    </w:lvl>
+    <w:lvl w:ilvl="3" w:tentative="1">
+      <w:start w:val="1"/>
+      <w:numFmt w:val="bullet"/>
+      <w:lvlText w:val=""/>
+      <w:lvlJc w:val="left"/>
+      <w:pPr>
+        <w:tabs>
+          <w:tab w:val="num" w:pos="2880"/>
+        </w:tabs>
+        <w:ind w:left="2880" w:hanging="360"/>
+      </w:pPr>
+      <w:rPr>
+        <w:rFonts w:ascii="Wingdings" w:hAnsi="Wingdings" w:hint="default"/>
+        <w:sz w:val="20"/>
+      </w:rPr>
+    </w:lvl>
+    <w:lvl w:ilvl="4" w:tentative="1">
+      <w:start w:val="1"/>
+      <w:numFmt w:val="bullet"/>
+      <w:lvlText w:val=""/>
+      <w:lvlJc w:val="left"/>
+      <w:pPr>
+        <w:tabs>
+          <w:tab w:val="num" w:pos="3600"/>
+        </w:tabs>
+        <w:ind w:left="3600" w:hanging="360"/>
+      </w:pPr>
+      <w:rPr>
+        <w:rFonts w:ascii="Wingdings" w:hAnsi="Wingdings" w:hint="default"/>
+        <w:sz w:val="20"/>
+      </w:rPr>
+    </w:lvl>
+    <w:lvl w:ilvl="5" w:tentative="1">
+      <w:start w:val="1"/>
+      <w:numFmt w:val="bullet"/>
+      <w:lvlText w:val=""/>
+      <w:lvlJc w:val="left"/>
+      <w:pPr>
+        <w:tabs>
+          <w:tab w:val="num" w:pos="4320"/>
+        </w:tabs>
+        <w:ind w:left="4320" w:hanging="360"/>
+      </w:pPr>
+      <w:rPr>
+        <w:rFonts w:ascii="Wingdings" w:hAnsi="Wingdings" w:hint="default"/>
+        <w:sz w:val="20"/>
+      </w:rPr>
+    </w:lvl>
+    <w:lvl w:ilvl="6" w:tentative="1">
+      <w:start w:val="1"/>
+      <w:numFmt w:val="bullet"/>
+      <w:lvlText w:val=""/>
+      <w:lvlJc w:val="left"/>
+      <w:pPr>
+        <w:tabs>
+          <w:tab w:val="num" w:pos="5040"/>
+        </w:tabs>
+        <w:ind w:left="5040" w:hanging="360"/>
+      </w:pPr>
+      <w:rPr>
+        <w:rFonts w:ascii="Wingdings" w:hAnsi="Wingdings" w:hint="default"/>
+        <w:sz w:val="20"/>
+      </w:rPr>
+    </w:lvl>
+    <w:lvl w:ilvl="7" w:tentative="1">
+      <w:start w:val="1"/>
+      <w:numFmt w:val="bullet"/>
+      <w:lvlText w:val=""/>
+      <w:lvlJc w:val="left"/>
+      <w:pPr>
+        <w:tabs>
+          <w:tab w:val="num" w:pos="5760"/>
+        </w:tabs>
+        <w:ind w:left="5760" w:hanging="360"/>
+      </w:pPr>
+      <w:rPr>
+        <w:rFonts w:ascii="Wingdings" w:hAnsi="Wingdings" w:hint="default"/>
+        <w:sz w:val="20"/>
+      </w:rPr>
+    </w:lvl>
+    <w:lvl w:ilvl="8" w:tentative="1">
+      <w:start w:val="1"/>
+      <w:numFmt w:val="bullet"/>
+      <w:lvlText w:val=""/>
+      <w:lvlJc w:val="left"/>
+      <w:pPr>
+        <w:tabs>
+          <w:tab w:val="num" w:pos="6480"/>
+        </w:tabs>
+        <w:ind w:left="6480" w:hanging="360"/>
+      </w:pPr>
+      <w:rPr>
+        <w:rFonts w:ascii="Wingdings" w:hAnsi="Wingdings" w:hint="default"/>
+        <w:sz w:val="20"/>
+      </w:rPr>
+    </w:lvl>
+  </w:abstractNum>
   <w:num w:numId="1" w16cid:durableId="325405235">
+    <w:abstractNumId w:val="5"/>
+  </w:num>
+  <w:num w:numId="2" w16cid:durableId="206575433">
+    <w:abstractNumId w:val="2"/>
+  </w:num>
+  <w:num w:numId="3" w16cid:durableId="51008602">
+    <w:abstractNumId w:val="7"/>
+  </w:num>
+  <w:num w:numId="4" w16cid:durableId="1632900915">
+    <w:abstractNumId w:val="4"/>
+  </w:num>
+  <w:num w:numId="5" w16cid:durableId="1483086268">
+    <w:abstractNumId w:val="3"/>
+  </w:num>
+  <w:num w:numId="6" w16cid:durableId="1086153247">
+    <w:abstractNumId w:val="1"/>
+  </w:num>
+  <w:num w:numId="7" w16cid:durableId="1903327519">
+    <w:abstractNumId w:val="6"/>
+  </w:num>
+  <w:num w:numId="8" w16cid:durableId="2025864402">
     <w:abstractNumId w:val="0"/>
   </w:num>
 </w:numbering>
@@ -956,6 +1923,7 @@
   <w:style w:type="paragraph" w:default="1" w:styleId="Normale">
     <w:name w:val="Normal"/>
     <w:qFormat/>
+    <w:rsid w:val="009B6B21"/>
   </w:style>
   <w:style w:type="paragraph" w:styleId="Titolo1">
     <w:name w:val="heading 1"/>

</xml_diff>

<commit_message>
Finished Anagrafica nel progetto
</commit_message>
<xml_diff>
--- a/Progetto.docx
+++ b/Progetto.docx
@@ -242,40 +242,75 @@
     </w:p>
     <w:p>
       <w:r>
-        <w:t>Contiene tutte le informazioni che riguardano, committenti, strutture, attività, partizioni, utenti.</w:t>
-      </w:r>
-    </w:p>
-    <w:p>
-      <w:r>
-        <w:t xml:space="preserve">I committenti sono i clienti, coloro che vengono a richiedere il servizio e vengono registrate le informazioni di contatto, come telefono, </w:t>
-      </w:r>
-      <w:proofErr w:type="gramStart"/>
-      <w:r>
-        <w:t>email</w:t>
-      </w:r>
-      <w:proofErr w:type="gramEnd"/>
-      <w:r>
-        <w:t>, indirizzo.</w:t>
-      </w:r>
-    </w:p>
-    <w:p>
-      <w:r>
-        <w:t>Le strutture, sono gli edifici, e le partizioni sono le stanze, nel quale vengono condotti i campionamenti.</w:t>
-      </w:r>
-    </w:p>
-    <w:p>
-      <w:proofErr w:type="gramStart"/>
-      <w:r>
-        <w:t>Le attività,</w:t>
-      </w:r>
-      <w:proofErr w:type="gramEnd"/>
-      <w:r>
-        <w:t xml:space="preserve"> sono il nome che viene definito per definire che funziona ha il campionamento. (da rivedere) </w:t>
-      </w:r>
-    </w:p>
-    <w:p>
-      <w:r>
-        <w:t xml:space="preserve">Gli utenti sono coloro che possono accedere al sistema e il tipo di diritti che hanno all’interno di esso. </w:t>
+        <w:t xml:space="preserve">L’anagrafica svolge il ruolo di registro centrale delle entità strutturali, dei soggetti e delle attività di laboratorio. </w:t>
+      </w:r>
+    </w:p>
+    <w:p>
+      <w:r>
+        <w:t xml:space="preserve">Nel dettaglio il modulo gestisce i profili dei committenti, ossia i clienti esterni o gli enti terzi che richiedono le </w:t>
+      </w:r>
+      <w:r>
+        <w:t>prestazioni analitiche del CIAS. Per ciascun committente, il sistema archivia sistematicamente le informazioni di contatto, come recapiti telefonici, indirizzi di posta elettronica e sedi fisiche, garantendo la tracciabilità amministrativa e la corretta associazione delle commesse.</w:t>
+      </w:r>
+      <w:r>
+        <w:t xml:space="preserve"> </w:t>
+      </w:r>
+    </w:p>
+    <w:p>
+      <w:r>
+        <w:t xml:space="preserve">Dal punto di vista logistico, </w:t>
+      </w:r>
+      <w:r>
+        <w:t>l’</w:t>
+      </w:r>
+      <w:r>
+        <w:t>a</w:t>
+      </w:r>
+      <w:r>
+        <w:t xml:space="preserve">nagrafica mappa </w:t>
+      </w:r>
+      <w:r>
+        <w:t>i</w:t>
+      </w:r>
+      <w:r>
+        <w:t xml:space="preserve"> siti di indagine tramite un legame gerarchico tra strutture e partizioni. Le strutture rappresentano i complessi edilizi, i presidi ospedalieri o i siti industriali nella loro interezza, mentre le partizioni ne definiscono le macro-suddivisioni interne, come piani o settori di un edificio.</w:t>
+      </w:r>
+    </w:p>
+    <w:p>
+      <w:r>
+        <w:t>Le attività invece</w:t>
+      </w:r>
+      <w:r>
+        <w:t xml:space="preserve"> sono i</w:t>
+      </w:r>
+      <w:r>
+        <w:t xml:space="preserve"> progetti assegnati e gestiti dal laboratorio. Ogni attività è caratterizzata da una gerarchia di attributi, comprendente una tipologia specifica che ne determina natura e finalità (ad esempio, </w:t>
+      </w:r>
+      <w:r>
+        <w:t xml:space="preserve">progetto di </w:t>
+      </w:r>
+      <w:r>
+        <w:t>ricerca, monitoraggi</w:t>
+      </w:r>
+      <w:r>
+        <w:t>, etc.…</w:t>
+      </w:r>
+      <w:r>
+        <w:t>) e uno stato operativo</w:t>
+      </w:r>
+      <w:r>
+        <w:t>.</w:t>
+      </w:r>
+    </w:p>
+    <w:p>
+      <w:r>
+        <w:t xml:space="preserve">Infine, nel blocco degli utenti, viene censito </w:t>
+      </w:r>
+      <w:r>
+        <w:t>il personale autorizzato a interagire con il sistema software e assegnando a ciascun profilo una specifica matrice di diritti e permessi operativi. Questa profilazione è essenziale per regolamentare in modo gerarchico i livelli di accesso alle funzionalità di inserimento, modifica o sola consultazione dei dati, garantendo la sicurezza informatica e l'integrità delle informazioni in conformità con i requisiti ispettivi.</w:t>
+      </w:r>
+      <w:r>
+        <w:t xml:space="preserve"> </w:t>
       </w:r>
     </w:p>
     <w:p>
@@ -293,20 +328,18 @@
       <w:r>
         <w:t xml:space="preserve">un insieme di oggetti </w:t>
       </w:r>
+      <w:r>
+        <w:t>eterogeni</w:t>
+      </w:r>
+      <w:r>
+        <w:t xml:space="preserve"> che rappresentano parti fondamentali per la descrizione del progetto, come strumenti di campionamento, antibiotici, piastre, punti di campionamento, tipologia stanza, </w:t>
+      </w:r>
       <w:proofErr w:type="spellStart"/>
       <w:r>
-        <w:t>etereogeni</w:t>
+        <w:t>etc</w:t>
       </w:r>
       <w:proofErr w:type="spellEnd"/>
       <w:r>
-        <w:t xml:space="preserve"> che rappresentano parti fondamentali per la descrizione del progetto, come strumenti di campionamento, antibiotici, piastre, punti di campionamento, tipologia stanza, </w:t>
-      </w:r>
-      <w:proofErr w:type="spellStart"/>
-      <w:r>
-        <w:t>etc</w:t>
-      </w:r>
-      <w:proofErr w:type="spellEnd"/>
-      <w:r>
         <w:t>…</w:t>
       </w:r>
     </w:p>
@@ -345,6 +378,7 @@
     </w:p>
     <w:p>
       <w:r>
+        <w:lastRenderedPageBreak/>
         <w:t xml:space="preserve">Una campagna può avere molteplici verbali, ma un verbale appartiene solo ad ‘una campagna. Quindi una volta definita la campagna, aggiungendo la partizione e l’area di partizione e la tipologia di </w:t>
       </w:r>
       <w:proofErr w:type="gramStart"/>
@@ -410,7 +444,6 @@
         </w:numPr>
       </w:pPr>
       <w:r>
-        <w:lastRenderedPageBreak/>
         <w:t>Accettazione che viene compilata al ritorno dal campionamento se intorno, o alla consegna dei compiano da parte dell’ente esterno, che riporta dettagli del campionamento e del trasporto appena svolto.</w:t>
       </w:r>
       <w:r>

</xml_diff>